<commit_message>
Finalize internship submission structure and documentation
</commit_message>
<xml_diff>
--- a/SuperMarketDataAnalytics_ProjectReport.docx
+++ b/SuperMarketDataAnalytics_ProjectReport.docx
@@ -11,7 +11,7 @@
           <w:b/>
           <w:sz w:val="48"/>
         </w:rPr>
-        <w:t>Super Market Data Analytics</w:t>
+        <w:t>SuperMarket Data Analytics</w:t>
       </w:r>
     </w:p>
     <w:p>
@@ -30,9 +30,7 @@
       </w:r>
     </w:p>
     <w:p>
-      <w:r>
-        <w:br w:type="page"/>
-      </w:r>
+      <w:r/>
     </w:p>
     <w:p>
       <w:pPr>
@@ -277,40 +275,7 @@
       </w:r>
     </w:p>
     <w:p>
-      <w:r>
-        <w:drawing>
-          <wp:inline xmlns:a="http://schemas.openxmlformats.org/drawingml/2006/main" xmlns:pic="http://schemas.openxmlformats.org/drawingml/2006/picture">
-            <wp:extent cx="5760720" cy="3046180"/>
-            <wp:docPr id="1" name="Picture 1"/>
-            <wp:cNvGraphicFramePr>
-              <a:graphicFrameLocks noChangeAspect="1"/>
-            </wp:cNvGraphicFramePr>
-            <a:graphic>
-              <a:graphicData uri="http://schemas.openxmlformats.org/drawingml/2006/picture">
-                <pic:pic>
-                  <pic:nvPicPr>
-                    <pic:cNvPr id="0" name="monthly_sales.png"/>
-                    <pic:cNvPicPr/>
-                  </pic:nvPicPr>
-                  <pic:blipFill>
-                    <a:blip r:embed="rId9"/>
-                    <a:stretch>
-                      <a:fillRect/>
-                    </a:stretch>
-                  </pic:blipFill>
-                  <pic:spPr>
-                    <a:xfrm>
-                      <a:off x="0" y="0"/>
-                      <a:ext cx="5760720" cy="3046180"/>
-                    </a:xfrm>
-                    <a:prstGeom prst="rect"/>
-                  </pic:spPr>
-                </pic:pic>
-              </a:graphicData>
-            </a:graphic>
-          </wp:inline>
-        </w:drawing>
-      </w:r>
+      <w:r/>
     </w:p>
     <w:p>
       <w:pPr>
@@ -321,40 +286,7 @@
       </w:r>
     </w:p>
     <w:p>
-      <w:r>
-        <w:drawing>
-          <wp:inline xmlns:a="http://schemas.openxmlformats.org/drawingml/2006/main" xmlns:pic="http://schemas.openxmlformats.org/drawingml/2006/picture">
-            <wp:extent cx="5760720" cy="3039699"/>
-            <wp:docPr id="2" name="Picture 2"/>
-            <wp:cNvGraphicFramePr>
-              <a:graphicFrameLocks noChangeAspect="1"/>
-            </wp:cNvGraphicFramePr>
-            <a:graphic>
-              <a:graphicData uri="http://schemas.openxmlformats.org/drawingml/2006/picture">
-                <pic:pic>
-                  <pic:nvPicPr>
-                    <pic:cNvPr id="0" name="category_sales.png"/>
-                    <pic:cNvPicPr/>
-                  </pic:nvPicPr>
-                  <pic:blipFill>
-                    <a:blip r:embed="rId10"/>
-                    <a:stretch>
-                      <a:fillRect/>
-                    </a:stretch>
-                  </pic:blipFill>
-                  <pic:spPr>
-                    <a:xfrm>
-                      <a:off x="0" y="0"/>
-                      <a:ext cx="5760720" cy="3039699"/>
-                    </a:xfrm>
-                    <a:prstGeom prst="rect"/>
-                  </pic:spPr>
-                </pic:pic>
-              </a:graphicData>
-            </a:graphic>
-          </wp:inline>
-        </w:drawing>
-      </w:r>
+      <w:r/>
     </w:p>
     <w:p>
       <w:pPr>
@@ -365,40 +297,7 @@
       </w:r>
     </w:p>
     <w:p>
-      <w:r>
-        <w:drawing>
-          <wp:inline xmlns:a="http://schemas.openxmlformats.org/drawingml/2006/main" xmlns:pic="http://schemas.openxmlformats.org/drawingml/2006/picture">
-            <wp:extent cx="5760720" cy="3039699"/>
-            <wp:docPr id="3" name="Picture 3"/>
-            <wp:cNvGraphicFramePr>
-              <a:graphicFrameLocks noChangeAspect="1"/>
-            </wp:cNvGraphicFramePr>
-            <a:graphic>
-              <a:graphicData uri="http://schemas.openxmlformats.org/drawingml/2006/picture">
-                <pic:pic>
-                  <pic:nvPicPr>
-                    <pic:cNvPr id="0" name="branch_sales.png"/>
-                    <pic:cNvPicPr/>
-                  </pic:nvPicPr>
-                  <pic:blipFill>
-                    <a:blip r:embed="rId11"/>
-                    <a:stretch>
-                      <a:fillRect/>
-                    </a:stretch>
-                  </pic:blipFill>
-                  <pic:spPr>
-                    <a:xfrm>
-                      <a:off x="0" y="0"/>
-                      <a:ext cx="5760720" cy="3039699"/>
-                    </a:xfrm>
-                    <a:prstGeom prst="rect"/>
-                  </pic:spPr>
-                </pic:pic>
-              </a:graphicData>
-            </a:graphic>
-          </wp:inline>
-        </w:drawing>
-      </w:r>
+      <w:r/>
     </w:p>
     <w:p>
       <w:pPr>
@@ -575,40 +474,7 @@
       </w:tr>
     </w:tbl>
     <w:p>
-      <w:r>
-        <w:drawing>
-          <wp:inline xmlns:a="http://schemas.openxmlformats.org/drawingml/2006/main" xmlns:pic="http://schemas.openxmlformats.org/drawingml/2006/picture">
-            <wp:extent cx="5760720" cy="3039699"/>
-            <wp:docPr id="4" name="Picture 4"/>
-            <wp:cNvGraphicFramePr>
-              <a:graphicFrameLocks noChangeAspect="1"/>
-            </wp:cNvGraphicFramePr>
-            <a:graphic>
-              <a:graphicData uri="http://schemas.openxmlformats.org/drawingml/2006/picture">
-                <pic:pic>
-                  <pic:nvPicPr>
-                    <pic:cNvPr id="0" name="feature_importance.png"/>
-                    <pic:cNvPicPr/>
-                  </pic:nvPicPr>
-                  <pic:blipFill>
-                    <a:blip r:embed="rId12"/>
-                    <a:stretch>
-                      <a:fillRect/>
-                    </a:stretch>
-                  </pic:blipFill>
-                  <pic:spPr>
-                    <a:xfrm>
-                      <a:off x="0" y="0"/>
-                      <a:ext cx="5760720" cy="3039699"/>
-                    </a:xfrm>
-                    <a:prstGeom prst="rect"/>
-                  </pic:spPr>
-                </pic:pic>
-              </a:graphicData>
-            </a:graphic>
-          </wp:inline>
-        </w:drawing>
-      </w:r>
+      <w:r/>
     </w:p>
     <w:p>
       <w:pPr>
@@ -655,6 +521,84 @@
     <w:p>
       <w:r>
         <w:t>The project demonstrates a complete analytics workflow from extracted data to validated KPIs, trends, business insights, and actions. The model is included only after rejecting leakage-prone Sales prediction as a meaningful target.</w:t>
+      </w:r>
+    </w:p>
+    <w:p>
+      <w:pPr>
+        <w:pStyle w:val="Heading1"/>
+      </w:pPr>
+      <w:r>
+        <w:t>Actual Web Application Screenshot</w:t>
+      </w:r>
+    </w:p>
+    <w:p>
+      <w:r>
+        <w:t>The following screenshot shows the completed supermarket-specific dashboard running with the validated dataset, including the calculated KPI cards, data-quality status, filters, and charts.</w:t>
+      </w:r>
+    </w:p>
+    <w:p>
+      <w:pPr>
+        <w:jc w:val="center"/>
+      </w:pPr>
+      <w:r>
+        <w:drawing>
+          <wp:inline xmlns:a="http://schemas.openxmlformats.org/drawingml/2006/main" xmlns:pic="http://schemas.openxmlformats.org/drawingml/2006/picture">
+            <wp:extent cx="5852160" cy="4305616"/>
+            <wp:docPr id="1" name="Picture 1"/>
+            <wp:cNvGraphicFramePr>
+              <a:graphicFrameLocks noChangeAspect="1"/>
+            </wp:cNvGraphicFramePr>
+            <a:graphic>
+              <a:graphicData uri="http://schemas.openxmlformats.org/drawingml/2006/picture">
+                <pic:pic>
+                  <pic:nvPicPr>
+                    <pic:cNvPr id="0" name="webdev-preview-root-1790232942442281984-1279.png"/>
+                    <pic:cNvPicPr/>
+                  </pic:nvPicPr>
+                  <pic:blipFill>
+                    <a:blip r:embed="rId13"/>
+                    <a:stretch>
+                      <a:fillRect/>
+                    </a:stretch>
+                  </pic:blipFill>
+                  <pic:spPr>
+                    <a:xfrm>
+                      <a:off x="0" y="0"/>
+                      <a:ext cx="5852160" cy="4305616"/>
+                    </a:xfrm>
+                    <a:prstGeom prst="rect"/>
+                  </pic:spPr>
+                </pic:pic>
+              </a:graphicData>
+            </a:graphic>
+          </wp:inline>
+        </w:drawing>
+      </w:r>
+    </w:p>
+    <w:p>
+      <w:pPr>
+        <w:pStyle w:val="Heading1"/>
+      </w:pPr>
+      <w:r>
+        <w:t>Technologies Used</w:t>
+      </w:r>
+    </w:p>
+    <w:p>
+      <w:r>
+        <w:t>Python, pandas, NumPy, scikit-learn, Matplotlib, Seaborn, Jupyter Notebook, React, TypeScript, Vite, Recharts, and Lucide icons.</w:t>
+      </w:r>
+    </w:p>
+    <w:p>
+      <w:pPr>
+        <w:pStyle w:val="Heading1"/>
+      </w:pPr>
+      <w:r>
+        <w:t>Future Scope</w:t>
+      </w:r>
+    </w:p>
+    <w:p>
+      <w:r>
+        <w:t>Future work could add validated inventory and margin fields, payment-failure data, a longer customer history, a date-range control, and a genuine future outcome target before introducing predictive modeling.</w:t>
       </w:r>
     </w:p>
     <w:sectPr>

</xml_diff>

<commit_message>
Expand internship submission documentation and analysis
</commit_message>
<xml_diff>
--- a/SuperMarketDataAnalytics_ProjectReport.docx
+++ b/SuperMarketDataAnalytics_ProjectReport.docx
@@ -601,6 +601,643 @@
         <w:t>Future work could add validated inventory and margin fields, payment-failure data, a longer customer history, a date-range control, and a genuine future outcome target before introducing predictive modeling.</w:t>
       </w:r>
     </w:p>
+    <w:p>
+      <w:pPr>
+        <w:pStyle w:val="Heading1"/>
+      </w:pPr>
+      <w:r>
+        <w:t>Introduction</w:t>
+      </w:r>
+    </w:p>
+    <w:p>
+      <w:r>
+        <w:t>This internship project applies a complete data analytics workflow to the supplied supermarket transaction table. It is designed for the IBM SkillsBuild Data Analytics with AI Academic Internship Program conducted by BharatCares in association with AICTE.</w:t>
+      </w:r>
+    </w:p>
+    <w:p>
+      <w:pPr>
+        <w:pStyle w:val="Heading1"/>
+      </w:pPr>
+      <w:r>
+        <w:t>Project Scope</w:t>
+      </w:r>
+    </w:p>
+    <w:p>
+      <w:r>
+        <w:t>The scope covers transaction validation, cleaning, descriptive statistics, KPI calculation, sales and time trends, product and category contribution, branch and city comparisons, customer and payment analysis, rating analysis, business insights, and an interactive dashboard. Profitability and customer-lifecycle analysis are outside scope because the source does not contain the required fields.</w:t>
+      </w:r>
+    </w:p>
+    <w:p>
+      <w:pPr>
+        <w:pStyle w:val="Heading1"/>
+      </w:pPr>
+      <w:r>
+        <w:t>Dataset Dictionary / Column Explanation</w:t>
+      </w:r>
+    </w:p>
+    <w:tbl>
+      <w:tblPr>
+        <w:tblStyle w:val="TableGrid"/>
+        <w:tblW w:type="auto" w:w="0"/>
+        <w:tblLook w:firstColumn="1" w:firstRow="1" w:lastColumn="0" w:lastRow="0" w:noHBand="0" w:noVBand="1" w:val="04A0"/>
+      </w:tblPr>
+      <w:tblGrid>
+        <w:gridCol w:w="3312"/>
+        <w:gridCol w:w="3312"/>
+        <w:gridCol w:w="3312"/>
+      </w:tblGrid>
+      <w:tr>
+        <w:tc>
+          <w:tcPr>
+            <w:tcW w:type="dxa" w:w="3312"/>
+          </w:tcPr>
+          <w:p>
+            <w:r>
+              <w:t>Column</w:t>
+            </w:r>
+          </w:p>
+        </w:tc>
+        <w:tc>
+          <w:tcPr>
+            <w:tcW w:type="dxa" w:w="3312"/>
+          </w:tcPr>
+          <w:p>
+            <w:r>
+              <w:t>Meaning</w:t>
+            </w:r>
+          </w:p>
+        </w:tc>
+        <w:tc>
+          <w:tcPr>
+            <w:tcW w:type="dxa" w:w="3312"/>
+          </w:tcPr>
+          <w:p>
+            <w:r>
+              <w:t>Type</w:t>
+            </w:r>
+          </w:p>
+        </w:tc>
+      </w:tr>
+      <w:tr>
+        <w:tc>
+          <w:tcPr>
+            <w:tcW w:type="dxa" w:w="3312"/>
+          </w:tcPr>
+          <w:p>
+            <w:r>
+              <w:t>Invoice ID</w:t>
+            </w:r>
+          </w:p>
+        </w:tc>
+        <w:tc>
+          <w:tcPr>
+            <w:tcW w:type="dxa" w:w="3312"/>
+          </w:tcPr>
+          <w:p>
+            <w:r>
+              <w:t>Unique transaction identifier</w:t>
+            </w:r>
+          </w:p>
+        </w:tc>
+        <w:tc>
+          <w:tcPr>
+            <w:tcW w:type="dxa" w:w="3312"/>
+          </w:tcPr>
+          <w:p>
+            <w:r>
+              <w:t>str</w:t>
+            </w:r>
+          </w:p>
+        </w:tc>
+      </w:tr>
+      <w:tr>
+        <w:tc>
+          <w:tcPr>
+            <w:tcW w:type="dxa" w:w="3312"/>
+          </w:tcPr>
+          <w:p>
+            <w:r>
+              <w:t>Date</w:t>
+            </w:r>
+          </w:p>
+        </w:tc>
+        <w:tc>
+          <w:tcPr>
+            <w:tcW w:type="dxa" w:w="3312"/>
+          </w:tcPr>
+          <w:p>
+            <w:r>
+              <w:t>Transaction date</w:t>
+            </w:r>
+          </w:p>
+        </w:tc>
+        <w:tc>
+          <w:tcPr>
+            <w:tcW w:type="dxa" w:w="3312"/>
+          </w:tcPr>
+          <w:p>
+            <w:r>
+              <w:t>str</w:t>
+            </w:r>
+          </w:p>
+        </w:tc>
+      </w:tr>
+      <w:tr>
+        <w:tc>
+          <w:tcPr>
+            <w:tcW w:type="dxa" w:w="3312"/>
+          </w:tcPr>
+          <w:p>
+            <w:r>
+              <w:t>Branch</w:t>
+            </w:r>
+          </w:p>
+        </w:tc>
+        <w:tc>
+          <w:tcPr>
+            <w:tcW w:type="dxa" w:w="3312"/>
+          </w:tcPr>
+          <w:p>
+            <w:r>
+              <w:t>Branch code</w:t>
+            </w:r>
+          </w:p>
+        </w:tc>
+        <w:tc>
+          <w:tcPr>
+            <w:tcW w:type="dxa" w:w="3312"/>
+          </w:tcPr>
+          <w:p>
+            <w:r>
+              <w:t>str</w:t>
+            </w:r>
+          </w:p>
+        </w:tc>
+      </w:tr>
+      <w:tr>
+        <w:tc>
+          <w:tcPr>
+            <w:tcW w:type="dxa" w:w="3312"/>
+          </w:tcPr>
+          <w:p>
+            <w:r>
+              <w:t>City</w:t>
+            </w:r>
+          </w:p>
+        </w:tc>
+        <w:tc>
+          <w:tcPr>
+            <w:tcW w:type="dxa" w:w="3312"/>
+          </w:tcPr>
+          <w:p>
+            <w:r>
+              <w:t>Store city</w:t>
+            </w:r>
+          </w:p>
+        </w:tc>
+        <w:tc>
+          <w:tcPr>
+            <w:tcW w:type="dxa" w:w="3312"/>
+          </w:tcPr>
+          <w:p>
+            <w:r>
+              <w:t>str</w:t>
+            </w:r>
+          </w:p>
+        </w:tc>
+      </w:tr>
+      <w:tr>
+        <w:tc>
+          <w:tcPr>
+            <w:tcW w:type="dxa" w:w="3312"/>
+          </w:tcPr>
+          <w:p>
+            <w:r>
+              <w:t>Customer Type</w:t>
+            </w:r>
+          </w:p>
+        </w:tc>
+        <w:tc>
+          <w:tcPr>
+            <w:tcW w:type="dxa" w:w="3312"/>
+          </w:tcPr>
+          <w:p>
+            <w:r>
+              <w:t>Member or Normal</w:t>
+            </w:r>
+          </w:p>
+        </w:tc>
+        <w:tc>
+          <w:tcPr>
+            <w:tcW w:type="dxa" w:w="3312"/>
+          </w:tcPr>
+          <w:p>
+            <w:r>
+              <w:t>str</w:t>
+            </w:r>
+          </w:p>
+        </w:tc>
+      </w:tr>
+      <w:tr>
+        <w:tc>
+          <w:tcPr>
+            <w:tcW w:type="dxa" w:w="3312"/>
+          </w:tcPr>
+          <w:p>
+            <w:r>
+              <w:t>Gender</w:t>
+            </w:r>
+          </w:p>
+        </w:tc>
+        <w:tc>
+          <w:tcPr>
+            <w:tcW w:type="dxa" w:w="3312"/>
+          </w:tcPr>
+          <w:p>
+            <w:r>
+              <w:t>Customer gender</w:t>
+            </w:r>
+          </w:p>
+        </w:tc>
+        <w:tc>
+          <w:tcPr>
+            <w:tcW w:type="dxa" w:w="3312"/>
+          </w:tcPr>
+          <w:p>
+            <w:r>
+              <w:t>str</w:t>
+            </w:r>
+          </w:p>
+        </w:tc>
+      </w:tr>
+      <w:tr>
+        <w:tc>
+          <w:tcPr>
+            <w:tcW w:type="dxa" w:w="3312"/>
+          </w:tcPr>
+          <w:p>
+            <w:r>
+              <w:t>Product</w:t>
+            </w:r>
+          </w:p>
+        </w:tc>
+        <w:tc>
+          <w:tcPr>
+            <w:tcW w:type="dxa" w:w="3312"/>
+          </w:tcPr>
+          <w:p>
+            <w:r>
+              <w:t>Product name</w:t>
+            </w:r>
+          </w:p>
+        </w:tc>
+        <w:tc>
+          <w:tcPr>
+            <w:tcW w:type="dxa" w:w="3312"/>
+          </w:tcPr>
+          <w:p>
+            <w:r>
+              <w:t>str</w:t>
+            </w:r>
+          </w:p>
+        </w:tc>
+      </w:tr>
+      <w:tr>
+        <w:tc>
+          <w:tcPr>
+            <w:tcW w:type="dxa" w:w="3312"/>
+          </w:tcPr>
+          <w:p>
+            <w:r>
+              <w:t>Category</w:t>
+            </w:r>
+          </w:p>
+        </w:tc>
+        <w:tc>
+          <w:tcPr>
+            <w:tcW w:type="dxa" w:w="3312"/>
+          </w:tcPr>
+          <w:p>
+            <w:r>
+              <w:t>Product grouping</w:t>
+            </w:r>
+          </w:p>
+        </w:tc>
+        <w:tc>
+          <w:tcPr>
+            <w:tcW w:type="dxa" w:w="3312"/>
+          </w:tcPr>
+          <w:p>
+            <w:r>
+              <w:t>str</w:t>
+            </w:r>
+          </w:p>
+        </w:tc>
+      </w:tr>
+      <w:tr>
+        <w:tc>
+          <w:tcPr>
+            <w:tcW w:type="dxa" w:w="3312"/>
+          </w:tcPr>
+          <w:p>
+            <w:r>
+              <w:t>Quantity</w:t>
+            </w:r>
+          </w:p>
+        </w:tc>
+        <w:tc>
+          <w:tcPr>
+            <w:tcW w:type="dxa" w:w="3312"/>
+          </w:tcPr>
+          <w:p>
+            <w:r>
+              <w:t>Units in transaction</w:t>
+            </w:r>
+          </w:p>
+        </w:tc>
+        <w:tc>
+          <w:tcPr>
+            <w:tcW w:type="dxa" w:w="3312"/>
+          </w:tcPr>
+          <w:p>
+            <w:r>
+              <w:t>float64</w:t>
+            </w:r>
+          </w:p>
+        </w:tc>
+      </w:tr>
+      <w:tr>
+        <w:tc>
+          <w:tcPr>
+            <w:tcW w:type="dxa" w:w="3312"/>
+          </w:tcPr>
+          <w:p>
+            <w:r>
+              <w:t>Unit Price</w:t>
+            </w:r>
+          </w:p>
+        </w:tc>
+        <w:tc>
+          <w:tcPr>
+            <w:tcW w:type="dxa" w:w="3312"/>
+          </w:tcPr>
+          <w:p>
+            <w:r>
+              <w:t>Price per unit</w:t>
+            </w:r>
+          </w:p>
+        </w:tc>
+        <w:tc>
+          <w:tcPr>
+            <w:tcW w:type="dxa" w:w="3312"/>
+          </w:tcPr>
+          <w:p>
+            <w:r>
+              <w:t>float64</w:t>
+            </w:r>
+          </w:p>
+        </w:tc>
+      </w:tr>
+      <w:tr>
+        <w:tc>
+          <w:tcPr>
+            <w:tcW w:type="dxa" w:w="3312"/>
+          </w:tcPr>
+          <w:p>
+            <w:r>
+              <w:t>Payment</w:t>
+            </w:r>
+          </w:p>
+        </w:tc>
+        <w:tc>
+          <w:tcPr>
+            <w:tcW w:type="dxa" w:w="3312"/>
+          </w:tcPr>
+          <w:p>
+            <w:r>
+              <w:t>Payment method</w:t>
+            </w:r>
+          </w:p>
+        </w:tc>
+        <w:tc>
+          <w:tcPr>
+            <w:tcW w:type="dxa" w:w="3312"/>
+          </w:tcPr>
+          <w:p>
+            <w:r>
+              <w:t>str</w:t>
+            </w:r>
+          </w:p>
+        </w:tc>
+      </w:tr>
+      <w:tr>
+        <w:tc>
+          <w:tcPr>
+            <w:tcW w:type="dxa" w:w="3312"/>
+          </w:tcPr>
+          <w:p>
+            <w:r>
+              <w:t>Rating</w:t>
+            </w:r>
+          </w:p>
+        </w:tc>
+        <w:tc>
+          <w:tcPr>
+            <w:tcW w:type="dxa" w:w="3312"/>
+          </w:tcPr>
+          <w:p>
+            <w:r>
+              <w:t>Customer feedback rating from 0 to 5</w:t>
+            </w:r>
+          </w:p>
+        </w:tc>
+        <w:tc>
+          <w:tcPr>
+            <w:tcW w:type="dxa" w:w="3312"/>
+          </w:tcPr>
+          <w:p>
+            <w:r>
+              <w:t>float64</w:t>
+            </w:r>
+          </w:p>
+        </w:tc>
+      </w:tr>
+      <w:tr>
+        <w:tc>
+          <w:tcPr>
+            <w:tcW w:type="dxa" w:w="3312"/>
+          </w:tcPr>
+          <w:p>
+            <w:r>
+              <w:t>Sales</w:t>
+            </w:r>
+          </w:p>
+        </w:tc>
+        <w:tc>
+          <w:tcPr>
+            <w:tcW w:type="dxa" w:w="3312"/>
+          </w:tcPr>
+          <w:p>
+            <w:r>
+              <w:t>Transaction sales value</w:t>
+            </w:r>
+          </w:p>
+        </w:tc>
+        <w:tc>
+          <w:tcPr>
+            <w:tcW w:type="dxa" w:w="3312"/>
+          </w:tcPr>
+          <w:p>
+            <w:r>
+              <w:t>float64</w:t>
+            </w:r>
+          </w:p>
+        </w:tc>
+      </w:tr>
+    </w:tbl>
+    <w:p>
+      <w:pPr>
+        <w:pStyle w:val="Heading1"/>
+      </w:pPr>
+      <w:r>
+        <w:t>Data Quality Assessment</w:t>
+      </w:r>
+    </w:p>
+    <w:p>
+      <w:r>
+        <w:t>The final extract contains 500 rows, 13 columns, 0 missing cells, 0 duplicate rows, 0 duplicate Invoice IDs, valid dates, positive quantities and prices, ratings within 0–5, and 0 Sales formula mismatches beyond the 0.01 validation tolerance. Descriptive Sales outliers are reported in the notebook and are not deleted merely because they are large valid transactions.</w:t>
+      </w:r>
+    </w:p>
+    <w:p>
+      <w:pPr>
+        <w:pStyle w:val="Heading1"/>
+      </w:pPr>
+      <w:r>
+        <w:t>Product and Category Analysis</w:t>
+      </w:r>
+    </w:p>
+    <w:p>
+      <w:r>
+        <w:t>Beverages is the leading category by Sales at ₹56,108.24. Cheese is the leading product at ₹27,906.30. These results support availability benchmarking, not a claim that category membership caused sales.</w:t>
+      </w:r>
+    </w:p>
+    <w:p>
+      <w:pPr>
+        <w:pStyle w:val="Heading1"/>
+      </w:pPr>
+      <w:r>
+        <w:t>Branch and City Analysis</w:t>
+      </w:r>
+    </w:p>
+    <w:p>
+      <w:r>
+        <w:t>Mumbai is the leading city by Sales at ₹72,469.45. Branch and city comparisons are descriptive and should be combined with inventory, footfall, and promotion data before operational reallocation.</w:t>
+      </w:r>
+    </w:p>
+    <w:p>
+      <w:pPr>
+        <w:pStyle w:val="Heading1"/>
+      </w:pPr>
+      <w:r>
+        <w:t>Customer Analysis</w:t>
+      </w:r>
+    </w:p>
+    <w:p>
+      <w:r>
+        <w:t>Customer analysis compares Member and Normal transactions and gender patterns using Sales, Quantity, transaction counts, average transaction value, and rating. The dataset does not provide longitudinal customer IDs, so retention and churn are not calculated.</w:t>
+      </w:r>
+    </w:p>
+    <w:p>
+      <w:pPr>
+        <w:pStyle w:val="Heading1"/>
+      </w:pPr>
+      <w:r>
+        <w:t>Payment Analysis</w:t>
+      </w:r>
+    </w:p>
+    <w:p>
+      <w:r>
+        <w:t>UPI is the most frequent payment method with 127 transactions. Payment mix supports service planning; it does not identify payment failures or profitability.</w:t>
+      </w:r>
+    </w:p>
+    <w:p>
+      <w:pPr>
+        <w:pStyle w:val="Heading1"/>
+      </w:pPr>
+      <w:r>
+        <w:t>Rating Analysis</w:t>
+      </w:r>
+    </w:p>
+    <w:p>
+      <w:r>
+        <w:t>The overall average rating is 3.99 out of 5. Category and branch rating comparisons are feedback signals for service review and are not causal proof.</w:t>
+      </w:r>
+    </w:p>
+    <w:p>
+      <w:pPr>
+        <w:pStyle w:val="Heading1"/>
+      </w:pPr>
+      <w:r>
+        <w:t>Time Trend Analysis</w:t>
+      </w:r>
+    </w:p>
+    <w:p>
+      <w:r>
+        <w:t>The notebook calculates monthly sales from 2026-01 through 2026-07, preserving the observed trend while noting that this is a short static window.</w:t>
+      </w:r>
+    </w:p>
+    <w:p>
+      <w:pPr>
+        <w:pStyle w:val="Heading1"/>
+      </w:pPr>
+      <w:r>
+        <w:t>Dashboard / Web Application</w:t>
+      </w:r>
+    </w:p>
+    <w:p>
+      <w:r>
+        <w:t>The web application is organized under web_application/ and provides Executive Overview, Sales &amp; Products, Customer Analysis, Branch &amp; City, Payment Analysis, Rating Analysis, and Business Insights sections. Its embedded source data matches dataset/supermarket_data.csv record-for-record. Filters update the displayed calculations without introducing demo data.</w:t>
+      </w:r>
+    </w:p>
+    <w:p>
+      <w:pPr>
+        <w:pStyle w:val="Heading1"/>
+      </w:pPr>
+      <w:r>
+        <w:t>Technical Architecture</w:t>
+      </w:r>
+    </w:p>
+    <w:p>
+      <w:r>
+        <w:t>The notebook is a Python/Jupyter analysis layer using pandas, NumPy, Matplotlib, Seaborn, and scikit-learn. The dashboard is a client-side React and TypeScript application built with Vite and Recharts. The static frontend embeds the validated records for reproducible local execution; no API keys, secrets, or database credentials are required.</w:t>
+      </w:r>
+    </w:p>
+    <w:p>
+      <w:pPr>
+        <w:pStyle w:val="Heading1"/>
+      </w:pPr>
+      <w:r>
+        <w:t>Results</w:t>
+      </w:r>
+    </w:p>
+    <w:p>
+      <w:r>
+        <w:t>The validated dataset produced total Sales of ₹244,411.08, 500 transactions, 2,768 units sold, average transaction value of ₹488.82, and average rating of 3.99/5.</w:t>
+      </w:r>
+    </w:p>
+    <w:p>
+      <w:pPr>
+        <w:pStyle w:val="Heading1"/>
+      </w:pPr>
+      <w:r>
+        <w:t>GitHub / Project Structure</w:t>
+      </w:r>
+    </w:p>
+    <w:p>
+      <w:r>
+        <w:t>The repository is SuperMarketDataAnalytics. Root submission files are README.md, requirements.txt, SuperMarketDataAnalytics.ipynb, and SuperMarketDataAnalytics_ProjectReport.docx. The actual dataset is in dataset/supermarket_data.csv and the complete web application is in web_application/.</w:t>
+      </w:r>
+    </w:p>
     <w:sectPr>
       <w:pgSz w:w="12240" w:h="15840"/>
       <w:pgMar w:top="1008" w:right="1152" w:bottom="1008" w:left="1152" w:header="720" w:footer="720" w:gutter="0"/>

</xml_diff>